<commit_message>
Simplify week 2 CoT note
</commit_message>
<xml_diff>
--- a/2주차/CoT_Note_모래시계_오르골.docx
+++ b/2주차/CoT_Note_모래시계_오르골.docx
@@ -3,247 +3,18 @@
 <w:document xmlns:wpc="http://schemas.microsoft.com/office/word/2010/wordprocessingCanvas" xmlns:mo="http://schemas.microsoft.com/office/mac/office/2008/main" xmlns:mc="http://schemas.openxmlformats.org/markup-compatibility/2006" xmlns:mv="urn:schemas-microsoft-com:mac:vml" xmlns:o="urn:schemas-microsoft-com:office:office" xmlns:r="http://schemas.openxmlformats.org/officeDocument/2006/relationships" xmlns:m="http://schemas.openxmlformats.org/officeDocument/2006/math" xmlns:v="urn:schemas-microsoft-com:vml" xmlns:wp14="http://schemas.microsoft.com/office/word/2010/wordprocessingDrawing" xmlns:wp="http://schemas.openxmlformats.org/drawingml/2006/wordprocessingDrawing" xmlns:w10="urn:schemas-microsoft-com:office:word" xmlns:w="http://schemas.openxmlformats.org/wordprocessingml/2006/main" xmlns:w14="http://schemas.microsoft.com/office/word/2010/wordml" xmlns:wpg="http://schemas.microsoft.com/office/word/2010/wordprocessingGroup" xmlns:wpi="http://schemas.microsoft.com/office/word/2010/wordprocessingInk" xmlns:wne="http://schemas.microsoft.com/office/word/2006/wordml" xmlns:wps="http://schemas.microsoft.com/office/word/2010/wordprocessingShape" mc:Ignorable="w14 wp14">
   <w:body>
     <w:p>
-      <w:pPr>
-        <w:spacing w:after="60"/>
-        <w:jc w:val="left"/>
-      </w:pPr>
       <w:r>
         <w:rPr>
           <w:rFonts w:ascii="Malgun Gothic" w:hAnsi="Malgun Gothic" w:eastAsia="Malgun Gothic"/>
           <w:b/>
-          <w:color w:val="241D18"/>
-          <w:sz w:val="44"/>
+          <w:sz w:val="32"/>
         </w:rPr>
-        <w:t>CoT Note · 2주차 Engineering CT</w:t>
-      </w:r>
-    </w:p>
-    <w:p>
-      <w:pPr>
-        <w:spacing w:after="240"/>
-      </w:pPr>
-      <w:r>
-        <w:rPr>
-          <w:rFonts w:ascii="Malgun Gothic" w:hAnsi="Malgun Gothic" w:eastAsia="Malgun Gothic"/>
-          <w:b w:val="0"/>
-        </w:rPr>
-        <w:t>주제: 모래시계와 태엽 오르골의 공통 추상화, 그리고 Wound Routine Player 프로토타입</w:t>
-      </w:r>
-    </w:p>
-    <w:tbl>
-      <w:tblPr>
-        <w:tblStyle w:val="TableGrid"/>
-        <w:tblW w:type="dxa" w:w="9360"/>
-        <w:tblLook w:firstColumn="1" w:firstRow="1" w:lastColumn="0" w:lastRow="0" w:noHBand="0" w:noVBand="1" w:val="04A0"/>
-        <w:tblInd w:w="120" w:type="dxa"/>
-      </w:tblPr>
-      <w:tblGrid>
-        <w:gridCol w:w="2700"/>
-        <w:gridCol w:w="6660"/>
-      </w:tblGrid>
-      <w:tr>
-        <w:tc>
-          <w:tcPr>
-            <w:tcW w:type="dxa" w:w="2700"/>
-            <w:shd w:fill="F2F4F7"/>
-          </w:tcPr>
-          <w:p>
-            <w:r/>
-            <w:r>
-              <w:rPr>
-                <w:rFonts w:ascii="Malgun Gothic" w:hAnsi="Malgun Gothic" w:eastAsia="Malgun Gothic"/>
-                <w:b/>
-                <w:color w:val="1F4D78"/>
-              </w:rPr>
-              <w:t>작성 목적</w:t>
-            </w:r>
-          </w:p>
-        </w:tc>
-        <w:tc>
-          <w:tcPr>
-            <w:tcW w:type="dxa" w:w="6660"/>
-          </w:tcPr>
-          <w:p>
-            <w:r/>
-            <w:r>
-              <w:rPr>
-                <w:rFonts w:ascii="Malgun Gothic" w:hAnsi="Malgun Gothic" w:eastAsia="Malgun Gothic"/>
-                <w:b w:val="0"/>
-              </w:rPr>
-              <w:t>최종 산출물보다 학습 과정과 판단 근거를 제출 가능한 형태로 기록</w:t>
-            </w:r>
-          </w:p>
-        </w:tc>
-      </w:tr>
-      <w:tr>
-        <w:tc>
-          <w:tcPr>
-            <w:tcW w:type="dxa" w:w="2700"/>
-            <w:shd w:fill="F2F4F7"/>
-          </w:tcPr>
-          <w:p>
-            <w:r/>
-            <w:r>
-              <w:rPr>
-                <w:rFonts w:ascii="Malgun Gothic" w:hAnsi="Malgun Gothic" w:eastAsia="Malgun Gothic"/>
-                <w:b/>
-                <w:color w:val="1F4D78"/>
-              </w:rPr>
-              <w:t>참고 자료</w:t>
-            </w:r>
-          </w:p>
-        </w:tc>
-        <w:tc>
-          <w:tcPr>
-            <w:tcW w:type="dxa" w:w="6660"/>
-          </w:tcPr>
-          <w:p>
-            <w:r/>
-            <w:r>
-              <w:rPr>
-                <w:rFonts w:ascii="Malgun Gothic" w:hAnsi="Malgun Gothic" w:eastAsia="Malgun Gothic"/>
-                <w:b w:val="0"/>
-              </w:rPr>
-              <w:t>2기_Course_Profile.pdf, 1주차 산출물, Engineering CT Docs Guidelines.pdf, [Engineering] Reference Book.pdf</w:t>
-            </w:r>
-          </w:p>
-        </w:tc>
-      </w:tr>
-      <w:tr>
-        <w:tc>
-          <w:tcPr>
-            <w:tcW w:type="dxa" w:w="2700"/>
-            <w:shd w:fill="F2F4F7"/>
-          </w:tcPr>
-          <w:p>
-            <w:r/>
-            <w:r>
-              <w:rPr>
-                <w:rFonts w:ascii="Malgun Gothic" w:hAnsi="Malgun Gothic" w:eastAsia="Malgun Gothic"/>
-                <w:b/>
-                <w:color w:val="1F4D78"/>
-              </w:rPr>
-              <w:t>최종 산출물</w:t>
-            </w:r>
-          </w:p>
-        </w:tc>
-        <w:tc>
-          <w:tcPr>
-            <w:tcW w:type="dxa" w:w="6660"/>
-          </w:tcPr>
-          <w:p>
-            <w:r/>
-            <w:r>
-              <w:rPr>
-                <w:rFonts w:ascii="Malgun Gothic" w:hAnsi="Malgun Gothic" w:eastAsia="Malgun Gothic"/>
-                <w:b w:val="0"/>
-              </w:rPr>
-              <w:t>2주차/과제_산출물.md, 2주차/prototype, 2주차/스크린샷</w:t>
-            </w:r>
-          </w:p>
-        </w:tc>
-      </w:tr>
-      <w:tr>
-        <w:tc>
-          <w:tcPr>
-            <w:tcW w:type="dxa" w:w="2700"/>
-            <w:shd w:fill="F2F4F7"/>
-          </w:tcPr>
-          <w:p>
-            <w:r/>
-            <w:r>
-              <w:rPr>
-                <w:rFonts w:ascii="Malgun Gothic" w:hAnsi="Malgun Gothic" w:eastAsia="Malgun Gothic"/>
-                <w:b/>
-                <w:color w:val="1F4D78"/>
-              </w:rPr>
-              <w:t>주의</w:t>
-            </w:r>
-          </w:p>
-        </w:tc>
-        <w:tc>
-          <w:tcPr>
-            <w:tcW w:type="dxa" w:w="6660"/>
-          </w:tcPr>
-          <w:p>
-            <w:r/>
-            <w:r>
-              <w:rPr>
-                <w:rFonts w:ascii="Malgun Gothic" w:hAnsi="Malgun Gothic" w:eastAsia="Malgun Gothic"/>
-                <w:b w:val="0"/>
-              </w:rPr>
-              <w:t>이 문서는 내부 추론 원문이 아니라 과제 진행 과정 요약과 결정 기록이다.</w:t>
-            </w:r>
-          </w:p>
-        </w:tc>
-      </w:tr>
-    </w:tbl>
-    <w:p>
-      <w:pPr>
-        <w:pStyle w:val="Heading1"/>
-      </w:pPr>
-      <w:r>
-        <w:t>1. 출발점과 과제 해석</w:t>
+        <w:t>CoT Note — Engineering 모래시계·오르골 2주차 과제</w:t>
       </w:r>
     </w:p>
     <w:p>
       <w:r>
-        <w:rPr>
-          <w:rFonts w:ascii="Malgun Gothic" w:hAnsi="Malgun Gothic" w:eastAsia="Malgun Gothic"/>
-          <w:b w:val="0"/>
-        </w:rPr>
-        <w:t>이번 과제는 1주차 모래시계 분석을 유지하면서 오르골을 추가하고, 두 사물의 공통 구조를 찾아 새로운 디지털 인터페이스로 옮기는 것이 핵심이었다. 따라서 프로토타입은 모래시계나 오르골을 직접 재현하지 않고, 두 사물에서 공통으로 발견되는 작동 원리를 가져와야 했다.</w:t>
-      </w:r>
-    </w:p>
-    <w:p>
-      <w:pPr>
-        <w:pStyle w:val="ListBullet"/>
-        <w:spacing w:after="80" w:line="280" w:lineRule="auto"/>
-      </w:pPr>
-      <w:r>
-        <w:rPr>
-          <w:rFonts w:ascii="Malgun Gothic" w:hAnsi="Malgun Gothic" w:eastAsia="Malgun Gothic"/>
-          <w:b w:val="0"/>
-        </w:rPr>
-        <w:t>분해는 사물별로 따로 작성한다.</w:t>
-      </w:r>
-    </w:p>
-    <w:p>
-      <w:pPr>
-        <w:pStyle w:val="ListBullet"/>
-        <w:spacing w:after="80" w:line="280" w:lineRule="auto"/>
-      </w:pPr>
-      <w:r>
-        <w:rPr>
-          <w:rFonts w:ascii="Malgun Gothic" w:hAnsi="Malgun Gothic" w:eastAsia="Malgun Gothic"/>
-          <w:b w:val="0"/>
-        </w:rPr>
-        <w:t>패턴 인식에서는 두 사물의 공통점과 차이점을 비교 매트릭스로 정리한다.</w:t>
-      </w:r>
-    </w:p>
-    <w:p>
-      <w:pPr>
-        <w:pStyle w:val="ListBullet"/>
-        <w:spacing w:after="80" w:line="280" w:lineRule="auto"/>
-      </w:pPr>
-      <w:r>
-        <w:rPr>
-          <w:rFonts w:ascii="Malgun Gothic" w:hAnsi="Malgun Gothic" w:eastAsia="Malgun Gothic"/>
-          <w:b w:val="0"/>
-        </w:rPr>
-        <w:t>추상화는 특정 사물 명칭에서 벗어나 디지털 UI에서 재사용 가능한 변수, 상태, 트리거로 바꾼다.</w:t>
-      </w:r>
-    </w:p>
-    <w:p>
-      <w:pPr>
-        <w:pStyle w:val="ListBullet"/>
-        <w:spacing w:after="80" w:line="280" w:lineRule="auto"/>
-      </w:pPr>
-      <w:r>
-        <w:rPr>
-          <w:rFonts w:ascii="Malgun Gothic" w:hAnsi="Malgun Gothic" w:eastAsia="Malgun Gothic"/>
-          <w:b w:val="0"/>
-        </w:rPr>
-        <w:t>플로우차트와 프로토타입은 추상화 모델에서 파생된 새 아이디어를 대상으로 한다.</w:t>
+        <w:t>각 단계에서 ① 내가 먼저 시도(Abduction) → ② AI와 비교(Gap) → ③ 도구 문장으로 남기기(Takeaway) 흐름으로, 실제로 막혔던 지점만 적었습니다.</w:t>
       </w:r>
     </w:p>
     <w:p>
@@ -251,713 +22,140 @@
         <w:pStyle w:val="Heading1"/>
       </w:pPr>
       <w:r>
-        <w:t>2. 자료 확인 기록</w:t>
+        <w:t>1. 분해안</w:t>
       </w:r>
     </w:p>
     <w:p>
-      <w:pPr>
-        <w:pStyle w:val="ListBullet"/>
-        <w:spacing w:after="80" w:line="280" w:lineRule="auto"/>
-      </w:pPr>
       <w:r>
-        <w:rPr>
-          <w:rFonts w:ascii="Malgun Gothic" w:hAnsi="Malgun Gothic" w:eastAsia="Malgun Gothic"/>
-          <w:b w:val="0"/>
-        </w:rPr>
-        <w:t>Course Profile에서 엔지니어링 수업의 목적이 “현실의 사물을 입력과 출력 구조로 읽고, 작동하는 프로토타입으로 구현하는 것”임을 확인했다.</w:t>
+        <w:t>내 첫 시도 — 1주차 모래시계는 어느 정도 있었지만, 오르골은 “태엽을 감으면 음악이 나온다” 정도로만 적고 중간 과정을 많이 비워 둠. 태엽, 기어, 실린더, 금속 빗을 다 부품 이름으로만 보고 데이터 변화로 못 바꿈.</w:t>
       </w:r>
     </w:p>
     <w:p>
-      <w:pPr>
-        <w:pStyle w:val="ListBullet"/>
-        <w:spacing w:after="80" w:line="280" w:lineRule="auto"/>
-      </w:pPr>
       <w:r>
-        <w:rPr>
-          <w:rFonts w:ascii="Malgun Gothic" w:hAnsi="Malgun Gothic" w:eastAsia="Malgun Gothic"/>
-          <w:b w:val="0"/>
-        </w:rPr>
-        <w:t>CT Docs Guidelines에서 분해는 숫자 또는 참/거짓 수준까지 내려가야 하고, 플로우차트는 If/Else 상태 변화로 정리해야 함을 확인했다.</w:t>
+        <w:t>AI와 비교 — 모래시계와 오르골을 각각 따로 분해하고, 둘 다 입력·저장·조절/처리·출력·종료 5단계로 맞춤. 오르골은 springTension, windTurns, cylinderAngle, melodyPosition, noteOn처럼 수치·참/거짓으로 내려감. 차이는 대부분 “부품 설명”과 “상태 변화 설명”을 구분 못 해서 생김.</w:t>
       </w:r>
     </w:p>
     <w:p>
-      <w:pPr>
-        <w:pStyle w:val="ListBullet"/>
-        <w:spacing w:after="80" w:line="280" w:lineRule="auto"/>
-      </w:pPr>
       <w:r>
-        <w:rPr>
-          <w:rFonts w:ascii="Malgun Gothic" w:hAnsi="Malgun Gothic" w:eastAsia="Malgun Gothic"/>
-          <w:b w:val="0"/>
-        </w:rPr>
-        <w:t>1주차 산출물에서는 모래시계를 “충전된 유한 자원이 시간에 따라 소모되고, 잔량이 진행도로 보이는 시스템”으로 이미 정리해 둔 점을 재사용했다.</w:t>
+        <w:t>배운 도구 — 사물 분해는 부품 목록이 아니라 입력→상태변화→출력 구조 · 저수준은 숫자/참거짓 · 오르골처럼 안 보이는 중간 과정은 저장 에너지와 전달 장치부터 찾기.</w:t>
       </w:r>
     </w:p>
-    <w:p>
-      <w:pPr>
-        <w:pStyle w:val="ListBullet"/>
-        <w:spacing w:after="80" w:line="280" w:lineRule="auto"/>
-      </w:pPr>
-      <w:r>
-        <w:rPr>
-          <w:rFonts w:ascii="Malgun Gothic" w:hAnsi="Malgun Gothic" w:eastAsia="Malgun Gothic"/>
-          <w:b w:val="0"/>
-        </w:rPr>
-        <w:t>Reference Book에서는 추상화, 상수/변수, 트리거, 종료 조건, 반복 루프 개념을 점검 기준으로 삼았다.</w:t>
-      </w:r>
-    </w:p>
+    <w:p/>
     <w:p>
       <w:pPr>
         <w:pStyle w:val="Heading1"/>
       </w:pPr>
       <w:r>
-        <w:t>3. 사물별 분해 과정 요약</w:t>
+        <w:t>2. 패턴 인식</w:t>
       </w:r>
     </w:p>
     <w:p>
-      <w:pPr>
-        <w:pStyle w:val="Heading2"/>
-      </w:pPr>
       <w:r>
-        <w:t>3-1. 모래시계</w:t>
+        <w:t>내 첫 시도 — 모래시계와 오르골의 공통점을 “시간이 지나면 끝난다” 정도로만 잡음. 출력이 하나는 모래, 하나는 음악이라 너무 다르다고 느꼈음.</w:t>
       </w:r>
     </w:p>
     <w:p>
-      <w:pPr>
-        <w:pStyle w:val="ListBullet"/>
-        <w:spacing w:after="80" w:line="280" w:lineRule="auto"/>
-      </w:pPr>
       <w:r>
-        <w:rPr>
-          <w:rFonts w:ascii="Malgun Gothic" w:hAnsi="Malgun Gothic" w:eastAsia="Malgun Gothic"/>
-          <w:b w:val="0"/>
-        </w:rPr>
-        <w:t>고수준 목적은 “고정량의 모래가 중력으로 이동하는 시간을 시각적으로 측정”하는 장치로 잡았다.</w:t>
+        <w:t>AI와 비교 — 겉출력은 다르지만 둘 다 유한 자원을 충전하고, 조절 장치를 통해 조금씩 방출하고, 방출 과정이 감각 출력으로 보인다는 공통 패턴을 찾음. 차이는 출력 방식(시각/청각), 충전량 조절 가능성, 조절 장치의 종류로 정리함.</w:t>
       </w:r>
     </w:p>
     <w:p>
-      <w:pPr>
-        <w:pStyle w:val="ListBullet"/>
-        <w:spacing w:after="80" w:line="280" w:lineRule="auto"/>
-      </w:pPr>
       <w:r>
-        <w:rPr>
-          <w:rFonts w:ascii="Malgun Gothic" w:hAnsi="Malgun Gothic" w:eastAsia="Malgun Gothic"/>
-          <w:b w:val="0"/>
-        </w:rPr>
-        <w:t>독립 상태변수는 상부 모래량 topSand 하나로 정리했다. bottomSand, remaining, progress, isDone은 topSand에서 파생된다.</w:t>
+        <w:t>배운 도구 — 공통점은 겉모습 말고 데이터 흐름에서 찾기 · 차이점은 같은 기준표 위에서 비교하기 · “자원 충전→조절된 방출→출력→자동 종료”처럼 동사 구조로 요약하기.</w:t>
       </w:r>
     </w:p>
-    <w:p>
-      <w:pPr>
-        <w:pStyle w:val="ListBullet"/>
-        <w:spacing w:after="80" w:line="280" w:lineRule="auto"/>
-      </w:pPr>
-      <w:r>
-        <w:rPr>
-          <w:rFonts w:ascii="Malgun Gothic" w:hAnsi="Malgun Gothic" w:eastAsia="Malgun Gothic"/>
-          <w:b w:val="0"/>
-        </w:rPr>
-        <w:t>주요 트리거는 flip과 tick이다. flip은 외부 입력이고 tick은 내부 반복이다.</w:t>
-      </w:r>
-    </w:p>
-    <w:p>
-      <w:pPr>
-        <w:pStyle w:val="Heading2"/>
-      </w:pPr>
-      <w:r>
-        <w:t>3-2. 태엽 오르골</w:t>
-      </w:r>
-    </w:p>
-    <w:p>
-      <w:pPr>
-        <w:pStyle w:val="ListBullet"/>
-        <w:spacing w:after="80" w:line="280" w:lineRule="auto"/>
-      </w:pPr>
-      <w:r>
-        <w:rPr>
-          <w:rFonts w:ascii="Malgun Gothic" w:hAnsi="Malgun Gothic" w:eastAsia="Malgun Gothic"/>
-          <w:b w:val="0"/>
-        </w:rPr>
-        <w:t>고수준 목적은 “태엽 장력을 조절된 회전 운동으로 바꾸고, 핀 실린더와 금속 빗을 통해 멜로디를 자동 재생”하는 장치로 잡았다.</w:t>
-      </w:r>
-    </w:p>
-    <w:p>
-      <w:pPr>
-        <w:pStyle w:val="ListBullet"/>
-        <w:spacing w:after="80" w:line="280" w:lineRule="auto"/>
-      </w:pPr>
-      <w:r>
-        <w:rPr>
-          <w:rFonts w:ascii="Malgun Gothic" w:hAnsi="Malgun Gothic" w:eastAsia="Malgun Gothic"/>
-          <w:b w:val="0"/>
-        </w:rPr>
-        <w:t>독립 상태변수는 springTension으로 정리했다. cylinderAngle, melodyPosition, noteOn, volume은 장력과 시간 흐름에서 파생된다.</w:t>
-      </w:r>
-    </w:p>
-    <w:p>
-      <w:pPr>
-        <w:pStyle w:val="ListBullet"/>
-        <w:spacing w:after="80" w:line="280" w:lineRule="auto"/>
-      </w:pPr>
-      <w:r>
-        <w:rPr>
-          <w:rFonts w:ascii="Malgun Gothic" w:hAnsi="Malgun Gothic" w:eastAsia="Malgun Gothic"/>
-          <w:b w:val="0"/>
-        </w:rPr>
-        <w:t>주요 트리거는 wind, release, tick, auto stop이다. wind와 release는 외부 입력이고 tick과 auto stop은 내부 조건이다.</w:t>
-      </w:r>
-    </w:p>
+    <w:p/>
     <w:p>
       <w:pPr>
         <w:pStyle w:val="Heading1"/>
       </w:pPr>
       <w:r>
-        <w:t>4. 패턴 인식에서 얻은 판단</w:t>
-      </w:r>
-    </w:p>
-    <w:p>
-      <w:pPr>
-        <w:pStyle w:val="ListBullet"/>
-        <w:spacing w:after="80" w:line="280" w:lineRule="auto"/>
-      </w:pPr>
-      <w:r>
-        <w:rPr>
-          <w:rFonts w:ascii="Malgun Gothic" w:hAnsi="Malgun Gothic" w:eastAsia="Malgun Gothic"/>
-          <w:b w:val="0"/>
-        </w:rPr>
-        <w:t>두 사물 모두 외부 입력으로 유한 자원을 준비한다. 모래시계는 상부 모래량, 오르골은 태엽 장력이다.</w:t>
-      </w:r>
-    </w:p>
-    <w:p>
-      <w:pPr>
-        <w:pStyle w:val="ListBullet"/>
-        <w:spacing w:after="80" w:line="280" w:lineRule="auto"/>
-      </w:pPr>
-      <w:r>
-        <w:rPr>
-          <w:rFonts w:ascii="Malgun Gothic" w:hAnsi="Malgun Gothic" w:eastAsia="Malgun Gothic"/>
-          <w:b w:val="0"/>
-        </w:rPr>
-        <w:t>두 사물 모두 조절 장치를 거쳐 자원이 시간에 따라 감소한다. 모래시계는 좁은 목, 오르골은 기어와 조속기 역할이 중요하다.</w:t>
-      </w:r>
-    </w:p>
-    <w:p>
-      <w:pPr>
-        <w:pStyle w:val="ListBullet"/>
-        <w:spacing w:after="80" w:line="280" w:lineRule="auto"/>
-      </w:pPr>
-      <w:r>
-        <w:rPr>
-          <w:rFonts w:ascii="Malgun Gothic" w:hAnsi="Malgun Gothic" w:eastAsia="Malgun Gothic"/>
-          <w:b w:val="0"/>
-        </w:rPr>
-        <w:t>사용자는 내부 자원량을 직접 읽는 것이 아니라 출력의 변화를 통해 상태를 이해한다. 모래시계는 시각 출력, 오르골은 청각 출력이 중심이다.</w:t>
-      </w:r>
-    </w:p>
-    <w:p>
-      <w:pPr>
-        <w:pStyle w:val="ListBullet"/>
-        <w:spacing w:after="80" w:line="280" w:lineRule="auto"/>
-      </w:pPr>
-      <w:r>
-        <w:rPr>
-          <w:rFonts w:ascii="Malgun Gothic" w:hAnsi="Malgun Gothic" w:eastAsia="Malgun Gothic"/>
-          <w:b w:val="0"/>
-        </w:rPr>
-        <w:t>종료는 사용자가 직접 결정하기보다 자원 소진 조건에 의해 자동 발생한다.</w:t>
+        <w:t>3. 추상화</w:t>
       </w:r>
     </w:p>
     <w:p>
       <w:r>
-        <w:rPr>
-          <w:rFonts w:ascii="Malgun Gothic" w:hAnsi="Malgun Gothic" w:eastAsia="Malgun Gothic"/>
-          <w:b/>
-        </w:rPr>
-        <w:t xml:space="preserve">핵심 문장: </w:t>
-      </w:r>
-      <w:r>
-        <w:rPr>
-          <w:rFonts w:ascii="Malgun Gothic" w:hAnsi="Malgun Gothic" w:eastAsia="Malgun Gothic"/>
-          <w:b w:val="0"/>
-        </w:rPr>
-        <w:t>물리적 입력으로 유한 자원을 충전하면, 내부 조절 장치가 그 자원을 일정한 속도로 방출하고, 방출 과정이 감각적 출력으로 변환되며, 자원이 소진되면 자동 종료된다.</w:t>
+        <w:t>내 첫 시도 — 모래, 태엽, 음악 같은 원래 사물 단어를 그대로 써서 추상화가 아니라 설명문처럼 됨. “시간 측정”으로 묶으려 했는데 오르골은 시간을 재는 물건이 아니라 어색했음.</w:t>
       </w:r>
     </w:p>
+    <w:p>
+      <w:r>
+        <w:t>AI와 비교 — 목적을 “시간 측정”에서 “유한 자원의 방출과 출력 패턴”으로 바꿈. topSand와 springTension을 charge로, flowRate와 태엽 방출 속도를 RELEASE_RATE로, 모래 높이와 멜로디를 OUTPUT_PATTERN으로 묶음. 포함/제외는 충전 가능성, 시간에 따른 방출, 출력 패턴 3조건으로 점검함.</w:t>
+      </w:r>
+    </w:p>
+    <w:p>
+      <w:r>
+        <w:t>배운 도구 — 추상화는 목적에 맞게 강도 조절 · 사물 단어를 도메인 중립 변수로 바꾸기 · 대입 테스트 3조건(충전 / 조절된 방출 / 감각 출력)으로 너무 좁거나 넓은지 확인.</w:t>
+      </w:r>
+    </w:p>
+    <w:p/>
     <w:p>
       <w:pPr>
         <w:pStyle w:val="Heading1"/>
       </w:pPr>
       <w:r>
-        <w:t>5. 추상화 조정 기록</w:t>
+        <w:t>4. 플로우차트</w:t>
       </w:r>
     </w:p>
     <w:p>
-      <w:pPr>
-        <w:pStyle w:val="ListBullet"/>
-        <w:spacing w:after="80" w:line="280" w:lineRule="auto"/>
-      </w:pPr>
       <w:r>
-        <w:rPr>
-          <w:rFonts w:ascii="Malgun Gothic" w:hAnsi="Malgun Gothic" w:eastAsia="Malgun Gothic"/>
-          <w:b w:val="0"/>
-        </w:rPr>
-        <w:t>처음에는 “시간 측정 장치”로 좁게 잡을 수 있었지만, 오르골은 시간을 측정하기보다 멜로디를 재생한다. 그래서 목적을 “측정”이 아니라 “충전된 자원의 방출과 출력 패턴”으로 조정했다.</w:t>
+        <w:t>내 첫 시도 — “감기→시작→끝” 정도의 순서도로만 생각하고, 잘못된 입력이나 일시정지 같은 상태는 빠뜨림. tick이 사용자 입력인지 내부 반복인지도 헷갈렸음.</w:t>
       </w:r>
     </w:p>
     <w:p>
-      <w:pPr>
-        <w:pStyle w:val="ListBullet"/>
-        <w:spacing w:after="80" w:line="280" w:lineRule="auto"/>
-      </w:pPr>
       <w:r>
-        <w:rPr>
-          <w:rFonts w:ascii="Malgun Gothic" w:hAnsi="Malgun Gothic" w:eastAsia="Malgun Gothic"/>
-          <w:b w:val="0"/>
-        </w:rPr>
-        <w:t>너무 넓게 잡으면 휴대폰 배터리, 달력, 줄자까지 들어올 수 있으므로 “충전 가능한 유한 자원”, “조절된 시간 방출”, “감각적 출력 패턴”이라는 세 조건을 스코프 기준으로 세웠다.</w:t>
+        <w:t>AI와 비교 — 상태를 IDLE, CHARGING, RUNNING, PAUSED, DONE으로 나누고, WIND, RELEASE, TICK, PAUSE, RESUME, RESET 입력을 상태 전이표에 모두 넣음. tick과 자동 완료는 내부 트리거, 버튼 조작은 외부 트리거로 분리함.</w:t>
       </w:r>
     </w:p>
     <w:p>
-      <w:pPr>
-        <w:pStyle w:val="ListBullet"/>
-        <w:spacing w:after="80" w:line="280" w:lineRule="auto"/>
-      </w:pPr>
       <w:r>
-        <w:rPr>
-          <w:rFonts w:ascii="Malgun Gothic" w:hAnsi="Malgun Gothic" w:eastAsia="Malgun Gothic"/>
-          <w:b w:val="0"/>
-        </w:rPr>
-        <w:t>디지털 프로토타입에는 원물에는 없는 PAUSED 상태를 추가했다. 이는 실제 사물 재현이 아니라 인터페이스 설계이기 때문에 허용되는 확장으로 보았다.</w:t>
+        <w:t>배운 도구 — 플로우차트 전에 상태 목록 먼저 확정 · 상태×입력 전이표로 no-op까지 적기 · 외부 조작과 내부 tick/자동 종료를 구분하면 충돌이 줄어듦.</w:t>
       </w:r>
     </w:p>
+    <w:p/>
     <w:p>
       <w:pPr>
         <w:pStyle w:val="Heading1"/>
       </w:pPr>
       <w:r>
-        <w:t>6. 프로토타입 아이디어 결정</w:t>
+        <w:t>5. 프로토타입</w:t>
       </w:r>
     </w:p>
     <w:p>
-      <w:pPr>
-        <w:pStyle w:val="ListBullet"/>
-        <w:spacing w:after="80" w:line="280" w:lineRule="auto"/>
-      </w:pPr>
       <w:r>
-        <w:rPr>
-          <w:rFonts w:ascii="Malgun Gothic" w:hAnsi="Malgun Gothic" w:eastAsia="Malgun Gothic"/>
-          <w:b w:val="0"/>
-        </w:rPr>
-        <w:t>직접 구현 후보였던 “디지털 모래시계”와 “디지털 오르골”은 과제 조건에 맞지 않아 제외했다.</w:t>
+        <w:t>내 첫 시도 — 모래시계와 오르골을 둘 다 화면에 예쁘게 구현해야 하나 고민함. 그러면 과제 조건인 “공통 추상화로 다른 아이디어 만들기”에서 벗어날 수 있었음.</w:t>
       </w:r>
     </w:p>
     <w:p>
-      <w:pPr>
-        <w:pStyle w:val="ListBullet"/>
-        <w:spacing w:after="80" w:line="280" w:lineRule="auto"/>
-      </w:pPr>
       <w:r>
-        <w:rPr>
-          <w:rFonts w:ascii="Malgun Gothic" w:hAnsi="Malgun Gothic" w:eastAsia="Malgun Gothic"/>
-          <w:b w:val="0"/>
-        </w:rPr>
-        <w:t>최종 아이디어는 Wound Routine Player로 정했다. 사용자가 태엽을 감듯 루틴 자원을 충전하고, 방출하면 충전량만큼 루틴 비트가 진행되는 인터페이스다.</w:t>
+        <w:t>AI와 비교 — 직접 재현 대신 Wound Routine Player로 정함. 사용자가 태엽을 감듯 루틴 자원을 충전하고, 방출하면 충전량만큼 루틴 비트가 진행됨. React에서는 상태 머신을 따로 만들고 테스트로 WIND, RELEASE, TICK, PAUSE, RESUME, RESET을 확인함.</w:t>
       </w:r>
     </w:p>
     <w:p>
-      <w:pPr>
-        <w:pStyle w:val="ListBullet"/>
-        <w:spacing w:after="80" w:line="280" w:lineRule="auto"/>
-      </w:pPr>
+      <w:r>
+        <w:t>배운 도구 — 프로토타입은 원물 복제가 아니라 추상화 검증물 · 먼저 상태 머신을 만들고 UI를 붙이기 · “보이는 화면”보다 “플로우차트대로 상태가 바뀌는가”를 검증 기준으로 삼기.</w:t>
+      </w:r>
+    </w:p>
+    <w:p/>
+    <w:p>
       <w:r>
         <w:rPr>
-          <w:rFonts w:ascii="Malgun Gothic" w:hAnsi="Malgun Gothic" w:eastAsia="Malgun Gothic"/>
-          <w:b w:val="0"/>
+          <w:b/>
         </w:rPr>
-        <w:t>이 아이디어는 모래시계의 잔량/진행도와 오르골의 비트/패턴 출력을 함께 반영한다.</w:t>
+        <w:t xml:space="preserve">요약 — </w:t>
       </w:r>
-    </w:p>
-    <w:p>
-      <w:pPr>
-        <w:pStyle w:val="ListBullet"/>
-        <w:spacing w:after="80" w:line="280" w:lineRule="auto"/>
-      </w:pPr>
       <w:r>
-        <w:rPr>
-          <w:rFonts w:ascii="Malgun Gothic" w:hAnsi="Malgun Gothic" w:eastAsia="Malgun Gothic"/>
-          <w:b w:val="0"/>
-        </w:rPr>
-        <w:t>React 앱에서는 상태 전이를 stateMachine.ts로 분리하여 WIND, RELEASE, TICK, PAUSE, RESUME, RESET을 명확하게 검증할 수 있게 했다.</w:t>
-      </w:r>
-    </w:p>
-    <w:p>
-      <w:pPr>
-        <w:pStyle w:val="Heading1"/>
-      </w:pPr>
-      <w:r>
-        <w:t>7. 구현 및 검증 기록</w:t>
-      </w:r>
-    </w:p>
-    <w:p>
-      <w:pPr>
-        <w:pStyle w:val="ListNumber"/>
-        <w:spacing w:after="80" w:line="280" w:lineRule="auto"/>
-      </w:pPr>
-      <w:r>
-        <w:rPr>
-          <w:rFonts w:ascii="Malgun Gothic" w:hAnsi="Malgun Gothic" w:eastAsia="Malgun Gothic"/>
-          <w:b w:val="0"/>
-        </w:rPr>
-        <w:t>상태 머신 테스트를 먼저 작성하고, 구현 전 실패를 확인했다.</w:t>
-      </w:r>
-    </w:p>
-    <w:p>
-      <w:pPr>
-        <w:pStyle w:val="ListNumber"/>
-        <w:spacing w:after="80" w:line="280" w:lineRule="auto"/>
-      </w:pPr>
-      <w:r>
-        <w:rPr>
-          <w:rFonts w:ascii="Malgun Gothic" w:hAnsi="Malgun Gothic" w:eastAsia="Malgun Gothic"/>
-          <w:b w:val="0"/>
-        </w:rPr>
-        <w:t>transition 함수와 selectRoutineView 함수를 구현해 상태 전이 테스트 7개를 통과시켰다.</w:t>
-      </w:r>
-    </w:p>
-    <w:p>
-      <w:pPr>
-        <w:pStyle w:val="ListNumber"/>
-        <w:spacing w:after="80" w:line="280" w:lineRule="auto"/>
-      </w:pPr>
-      <w:r>
-        <w:rPr>
-          <w:rFonts w:ascii="Malgun Gothic" w:hAnsi="Malgun Gothic" w:eastAsia="Malgun Gothic"/>
-          <w:b w:val="0"/>
-        </w:rPr>
-        <w:t>UI 테스트를 추가해 감기, 방출, 일시정지, 재개, 초기화 버튼 흐름을 검증했다.</w:t>
-      </w:r>
-    </w:p>
-    <w:p>
-      <w:pPr>
-        <w:pStyle w:val="ListNumber"/>
-        <w:spacing w:after="80" w:line="280" w:lineRule="auto"/>
-      </w:pPr>
-      <w:r>
-        <w:rPr>
-          <w:rFonts w:ascii="Malgun Gothic" w:hAnsi="Malgun Gothic" w:eastAsia="Malgun Gothic"/>
-          <w:b w:val="0"/>
-        </w:rPr>
-        <w:t>Vite production build를 실행해 TypeScript 컴파일과 번들 생성을 확인했다.</w:t>
-      </w:r>
-    </w:p>
-    <w:p>
-      <w:pPr>
-        <w:pStyle w:val="ListNumber"/>
-        <w:spacing w:after="80" w:line="280" w:lineRule="auto"/>
-      </w:pPr>
-      <w:r>
-        <w:rPr>
-          <w:rFonts w:ascii="Malgun Gothic" w:hAnsi="Malgun Gothic" w:eastAsia="Malgun Gothic"/>
-          <w:b w:val="0"/>
-        </w:rPr>
-        <w:t>Playwright로 로컬 프로토타입과 Vercel 배포 URL의 로딩 상태를 확인했다.</w:t>
-      </w:r>
-    </w:p>
-    <w:tbl>
-      <w:tblPr>
-        <w:tblStyle w:val="TableGrid"/>
-        <w:tblW w:type="dxa" w:w="9360"/>
-        <w:tblLook w:firstColumn="1" w:firstRow="1" w:lastColumn="0" w:lastRow="0" w:noHBand="0" w:noVBand="1" w:val="04A0"/>
-        <w:tblInd w:w="120" w:type="dxa"/>
-      </w:tblPr>
-      <w:tblGrid>
-        <w:gridCol w:w="2600"/>
-        <w:gridCol w:w="2100"/>
-        <w:gridCol w:w="4660"/>
-      </w:tblGrid>
-      <w:tr>
-        <w:tc>
-          <w:tcPr>
-            <w:tcW w:type="dxa" w:w="2600"/>
-            <w:shd w:fill="F2F4F7"/>
-          </w:tcPr>
-          <w:p>
-            <w:r/>
-            <w:r>
-              <w:rPr>
-                <w:rFonts w:ascii="Malgun Gothic" w:hAnsi="Malgun Gothic" w:eastAsia="Malgun Gothic"/>
-                <w:b/>
-                <w:color w:val="1F4D78"/>
-              </w:rPr>
-              <w:t>검증 항목</w:t>
-            </w:r>
-          </w:p>
-        </w:tc>
-        <w:tc>
-          <w:tcPr>
-            <w:tcW w:type="dxa" w:w="2100"/>
-            <w:shd w:fill="F2F4F7"/>
-          </w:tcPr>
-          <w:p>
-            <w:r/>
-            <w:r>
-              <w:rPr>
-                <w:rFonts w:ascii="Malgun Gothic" w:hAnsi="Malgun Gothic" w:eastAsia="Malgun Gothic"/>
-                <w:b/>
-                <w:color w:val="1F4D78"/>
-              </w:rPr>
-              <w:t>결과</w:t>
-            </w:r>
-          </w:p>
-        </w:tc>
-        <w:tc>
-          <w:tcPr>
-            <w:tcW w:type="dxa" w:w="4660"/>
-            <w:shd w:fill="F2F4F7"/>
-          </w:tcPr>
-          <w:p>
-            <w:r/>
-            <w:r>
-              <w:rPr>
-                <w:rFonts w:ascii="Malgun Gothic" w:hAnsi="Malgun Gothic" w:eastAsia="Malgun Gothic"/>
-                <w:b/>
-                <w:color w:val="1F4D78"/>
-              </w:rPr>
-              <w:t>근거</w:t>
-            </w:r>
-          </w:p>
-        </w:tc>
-      </w:tr>
-      <w:tr>
-        <w:tc>
-          <w:tcPr>
-            <w:tcW w:type="dxa" w:w="2600"/>
-          </w:tcPr>
-          <w:p>
-            <w:r/>
-            <w:r>
-              <w:rPr>
-                <w:rFonts w:ascii="Malgun Gothic" w:hAnsi="Malgun Gothic" w:eastAsia="Malgun Gothic"/>
-                <w:b w:val="0"/>
-              </w:rPr>
-              <w:t>상태 머신 테스트</w:t>
-            </w:r>
-          </w:p>
-        </w:tc>
-        <w:tc>
-          <w:tcPr>
-            <w:tcW w:type="dxa" w:w="2100"/>
-          </w:tcPr>
-          <w:p>
-            <w:r/>
-            <w:r>
-              <w:rPr>
-                <w:rFonts w:ascii="Malgun Gothic" w:hAnsi="Malgun Gothic" w:eastAsia="Malgun Gothic"/>
-                <w:b/>
-              </w:rPr>
-              <w:t>통과</w:t>
-            </w:r>
-          </w:p>
-        </w:tc>
-        <w:tc>
-          <w:tcPr>
-            <w:tcW w:type="dxa" w:w="4660"/>
-          </w:tcPr>
-          <w:p>
-            <w:r/>
-            <w:r>
-              <w:rPr>
-                <w:rFonts w:ascii="Malgun Gothic" w:hAnsi="Malgun Gothic" w:eastAsia="Malgun Gothic"/>
-                <w:b w:val="0"/>
-              </w:rPr>
-              <w:t>2 files, 9 tests passed</w:t>
-            </w:r>
-          </w:p>
-        </w:tc>
-      </w:tr>
-      <w:tr>
-        <w:tc>
-          <w:tcPr>
-            <w:tcW w:type="dxa" w:w="2600"/>
-          </w:tcPr>
-          <w:p>
-            <w:r/>
-            <w:r>
-              <w:rPr>
-                <w:rFonts w:ascii="Malgun Gothic" w:hAnsi="Malgun Gothic" w:eastAsia="Malgun Gothic"/>
-                <w:b w:val="0"/>
-              </w:rPr>
-              <w:t>프로덕션 빌드</w:t>
-            </w:r>
-          </w:p>
-        </w:tc>
-        <w:tc>
-          <w:tcPr>
-            <w:tcW w:type="dxa" w:w="2100"/>
-          </w:tcPr>
-          <w:p>
-            <w:r/>
-            <w:r>
-              <w:rPr>
-                <w:rFonts w:ascii="Malgun Gothic" w:hAnsi="Malgun Gothic" w:eastAsia="Malgun Gothic"/>
-                <w:b/>
-              </w:rPr>
-              <w:t>통과</w:t>
-            </w:r>
-          </w:p>
-        </w:tc>
-        <w:tc>
-          <w:tcPr>
-            <w:tcW w:type="dxa" w:w="4660"/>
-          </w:tcPr>
-          <w:p>
-            <w:r/>
-            <w:r>
-              <w:rPr>
-                <w:rFonts w:ascii="Malgun Gothic" w:hAnsi="Malgun Gothic" w:eastAsia="Malgun Gothic"/>
-                <w:b w:val="0"/>
-              </w:rPr>
-              <w:t>tsc -b &amp;&amp; vite build 성공</w:t>
-            </w:r>
-          </w:p>
-        </w:tc>
-      </w:tr>
-      <w:tr>
-        <w:tc>
-          <w:tcPr>
-            <w:tcW w:type="dxa" w:w="2600"/>
-          </w:tcPr>
-          <w:p>
-            <w:r/>
-            <w:r>
-              <w:rPr>
-                <w:rFonts w:ascii="Malgun Gothic" w:hAnsi="Malgun Gothic" w:eastAsia="Malgun Gothic"/>
-                <w:b w:val="0"/>
-              </w:rPr>
-              <w:t>Vercel 배포</w:t>
-            </w:r>
-          </w:p>
-        </w:tc>
-        <w:tc>
-          <w:tcPr>
-            <w:tcW w:type="dxa" w:w="2100"/>
-          </w:tcPr>
-          <w:p>
-            <w:r/>
-            <w:r>
-              <w:rPr>
-                <w:rFonts w:ascii="Malgun Gothic" w:hAnsi="Malgun Gothic" w:eastAsia="Malgun Gothic"/>
-                <w:b/>
-              </w:rPr>
-              <w:t>완료</w:t>
-            </w:r>
-          </w:p>
-        </w:tc>
-        <w:tc>
-          <w:tcPr>
-            <w:tcW w:type="dxa" w:w="4660"/>
-          </w:tcPr>
-          <w:p>
-            <w:r/>
-            <w:r>
-              <w:rPr>
-                <w:rFonts w:ascii="Malgun Gothic" w:hAnsi="Malgun Gothic" w:eastAsia="Malgun Gothic"/>
-                <w:b w:val="0"/>
-              </w:rPr>
-              <w:t>https://prototype-delta-sandy.vercel.app, HTTP 200 확인</w:t>
-            </w:r>
-          </w:p>
-        </w:tc>
-      </w:tr>
-    </w:tbl>
-    <w:p>
-      <w:pPr>
-        <w:pStyle w:val="Heading1"/>
-      </w:pPr>
-      <w:r>
-        <w:t>8. 배운 점과 다음 개선</w:t>
-      </w:r>
-    </w:p>
-    <w:p>
-      <w:pPr>
-        <w:pStyle w:val="ListBullet"/>
-        <w:spacing w:after="80" w:line="280" w:lineRule="auto"/>
-      </w:pPr>
-      <w:r>
-        <w:rPr>
-          <w:rFonts w:ascii="Malgun Gothic" w:hAnsi="Malgun Gothic" w:eastAsia="Malgun Gothic"/>
-          <w:b w:val="0"/>
-        </w:rPr>
-        <w:t>분해 단계에서는 “보이는 출력”보다 “상태를 바꾸는 데이터”를 먼저 찾아야 추상화가 쉬워졌다.</w:t>
-      </w:r>
-    </w:p>
-    <w:p>
-      <w:pPr>
-        <w:pStyle w:val="ListBullet"/>
-        <w:spacing w:after="80" w:line="280" w:lineRule="auto"/>
-      </w:pPr>
-      <w:r>
-        <w:rPr>
-          <w:rFonts w:ascii="Malgun Gothic" w:hAnsi="Malgun Gothic" w:eastAsia="Malgun Gothic"/>
-          <w:b w:val="0"/>
-        </w:rPr>
-        <w:t>패턴 인식은 단순 공통점 나열이 아니라, 두 사물의 차이를 설명할 수 있는 기준을 함께 세워야 했다.</w:t>
-      </w:r>
-    </w:p>
-    <w:p>
-      <w:pPr>
-        <w:pStyle w:val="ListBullet"/>
-        <w:spacing w:after="80" w:line="280" w:lineRule="auto"/>
-      </w:pPr>
-      <w:r>
-        <w:rPr>
-          <w:rFonts w:ascii="Malgun Gothic" w:hAnsi="Malgun Gothic" w:eastAsia="Malgun Gothic"/>
-          <w:b w:val="0"/>
-        </w:rPr>
-        <w:t>프로토타입은 원물의 형태를 복제하는 것보다, 상태 전이와 사용자의 조작 흐름이 추상화 모델과 일치하는지가 더 중요했다.</w:t>
-      </w:r>
-    </w:p>
-    <w:p>
-      <w:pPr>
-        <w:pStyle w:val="ListBullet"/>
-        <w:spacing w:after="80" w:line="280" w:lineRule="auto"/>
-      </w:pPr>
-      <w:r>
-        <w:rPr>
-          <w:rFonts w:ascii="Malgun Gothic" w:hAnsi="Malgun Gothic" w:eastAsia="Malgun Gothic"/>
-          <w:b w:val="0"/>
-        </w:rPr>
-        <w:t>다음 개선으로는 실제 음향 피드백, 루틴 비트 편집, 제출용 시연 영상 녹화가 가능하다.</w:t>
+        <w:t>분해는 부품이 아니라 데이터 변화, 패턴 인식은 겉모습이 아니라 공통 흐름, 추상화는 사물 비종속 명칭, 플로우차트는 상태×입력 전이표, 프로토타입은 원물 복제가 아니라 추상화 검증.</w:t>
       </w:r>
     </w:p>
     <w:sectPr>
-      <w:footerReference w:type="default" r:id="rId9"/>
       <w:pgSz w:w="12240" w:h="15840"/>
-      <w:pgMar w:top="1440" w:right="1440" w:bottom="1440" w:left="1440" w:header="708" w:footer="708" w:gutter="0"/>
+      <w:pgMar w:top="1440" w:right="1440" w:bottom="1440" w:left="1440" w:header="720" w:footer="720" w:gutter="0"/>
       <w:cols w:space="720"/>
       <w:docGrid w:linePitch="360"/>
     </w:sectPr>
   </w:body>
 </w:document>
-</file>
-
-<file path=word/footer1.xml><?xml version="1.0" encoding="utf-8"?>
-<w:ftr xmlns:m="http://schemas.openxmlformats.org/officeDocument/2006/math" xmlns:mc="http://schemas.openxmlformats.org/markup-compatibility/2006" xmlns:mo="http://schemas.microsoft.com/office/mac/office/2008/main" xmlns:mv="urn:schemas-microsoft-com:mac:vml" xmlns:o="urn:schemas-microsoft-com:office:office" xmlns:r="http://schemas.openxmlformats.org/officeDocument/2006/relationships" xmlns:v="urn:schemas-microsoft-com:vml" xmlns:w10="urn:schemas-microsoft-com:office:word" xmlns:w14="http://schemas.microsoft.com/office/word/2010/wordml" xmlns:w="http://schemas.openxmlformats.org/wordprocessingml/2006/main" xmlns:wne="http://schemas.microsoft.com/office/word/2006/wordml" xmlns:wp14="http://schemas.microsoft.com/office/word/2010/wordprocessingDrawing" xmlns:wp="http://schemas.openxmlformats.org/drawingml/2006/wordprocessingDrawing" xmlns:wpc="http://schemas.microsoft.com/office/word/2010/wordprocessingCanvas" xmlns:wpg="http://schemas.microsoft.com/office/word/2010/wordprocessingGroup" xmlns:wpi="http://schemas.microsoft.com/office/word/2010/wordprocessingInk" xmlns:wps="http://schemas.microsoft.com/office/word/2010/wordprocessingShape" mc:Ignorable="w14 wp14">
-  <w:p>
-    <w:pPr>
-      <w:pStyle w:val="Footer"/>
-      <w:jc w:val="right"/>
-    </w:pPr>
-    <w:r>
-      <w:rPr>
-        <w:rFonts w:ascii="Malgun Gothic" w:hAnsi="Malgun Gothic" w:eastAsia="Malgun Gothic"/>
-        <w:b w:val="0"/>
-      </w:rPr>
-      <w:t>2주차 Engineering CT · CoT Note</w:t>
-    </w:r>
-  </w:p>
-</w:ftr>
 </file>
 
 <file path=word/numbering.xml><?xml version="1.0" encoding="utf-8"?>
@@ -1324,11 +522,10 @@
     <w:qFormat/>
     <w:rsid w:val="00FC693F"/>
     <w:pPr>
-      <w:spacing w:after="120" w:line="264" w:lineRule="auto"/>
+      <w:spacing w:after="160" w:line="276" w:lineRule="auto"/>
     </w:pPr>
     <w:rPr>
       <w:rFonts w:ascii="Malgun Gothic" w:hAnsi="Malgun Gothic" w:eastAsia="Malgun Gothic"/>
-      <w:color w:val="000000"/>
       <w:sz w:val="22"/>
     </w:rPr>
   </w:style>
@@ -1387,14 +584,14 @@
     <w:pPr>
       <w:keepNext/>
       <w:keepLines/>
-      <w:spacing w:before="320" w:after="160"/>
+      <w:spacing w:before="240" w:after="120"/>
       <w:outlineLvl w:val="0"/>
     </w:pPr>
     <w:rPr>
       <w:rFonts w:asciiTheme="majorHAnsi" w:eastAsiaTheme="majorEastAsia" w:hAnsiTheme="majorHAnsi" w:cstheme="majorBidi" w:ascii="Malgun Gothic" w:hAnsi="Malgun Gothic" w:eastAsia="Malgun Gothic"/>
       <w:b/>
       <w:bCs/>
-      <w:color w:val="2E74B5"/>
+      <w:color w:val="365F91" w:themeColor="accent1" w:themeShade="BF"/>
       <w:sz w:val="32"/>
       <w:szCs w:val="28"/>
     </w:rPr>
@@ -1418,7 +615,7 @@
       <w:rFonts w:asciiTheme="majorHAnsi" w:eastAsiaTheme="majorEastAsia" w:hAnsiTheme="majorHAnsi" w:cstheme="majorBidi" w:ascii="Malgun Gothic" w:hAnsi="Malgun Gothic" w:eastAsia="Malgun Gothic"/>
       <w:b/>
       <w:bCs/>
-      <w:color w:val="2E74B5"/>
+      <w:color w:val="4F81BD" w:themeColor="accent1"/>
       <w:sz w:val="26"/>
       <w:szCs w:val="26"/>
     </w:rPr>
@@ -1435,15 +632,14 @@
     <w:pPr>
       <w:keepNext/>
       <w:keepLines/>
-      <w:spacing w:before="160" w:after="80"/>
+      <w:spacing w:before="200" w:after="0"/>
       <w:outlineLvl w:val="2"/>
     </w:pPr>
     <w:rPr>
-      <w:rFonts w:asciiTheme="majorHAnsi" w:eastAsiaTheme="majorEastAsia" w:hAnsiTheme="majorHAnsi" w:cstheme="majorBidi" w:ascii="Malgun Gothic" w:hAnsi="Malgun Gothic" w:eastAsia="Malgun Gothic"/>
+      <w:rFonts w:asciiTheme="majorHAnsi" w:eastAsiaTheme="majorEastAsia" w:hAnsiTheme="majorHAnsi" w:cstheme="majorBidi"/>
       <w:b/>
       <w:bCs/>
-      <w:color w:val="1F4D78"/>
-      <w:sz w:val="24"/>
+      <w:color w:val="4F81BD" w:themeColor="accent1"/>
     </w:rPr>
   </w:style>
   <w:style w:type="paragraph" w:styleId="Heading4">

</xml_diff>